<commit_message>
feat: add purchase, audit and contract checks
Add five SAM toolkit templates (proof of purchase, acquisition gate,
invoice verification, savings report, contract terms) and an audit
response method with demo data and practicum exercise 08.

Wire the new checks into the existing checklists, SOPs, skills, router,
agent and lifecycle rules so governance work uses them.

Fixes #29

Co-Authored-By: Claude Sonnet 5.5 <noreply@anthropic.com>
Claude-Session: https://claude.ai/code/session_011jjas23m3NwpgZMZpEjChK
</commit_message>
<xml_diff>
--- a/site/docs/ai-intake/checklist.docx
+++ b/site/docs/ai-intake/checklist.docx
@@ -218,6 +218,93 @@
           <w:b/>
         </w:rPr>
         <w:t xml:space="preserve">XW-021</w:t>
+      </w:r>
+    </w:p>
+    <w:p>
+      <w:pPr>
+        <w:spacing w:after="60"/>
+        <w:ind w:left="720" w:hanging="360"/>
+      </w:pPr>
+      <w:r>
+        <w:t xml:space="preserve">11.</w:t>
+      </w:r>
+      <w:r>
+        <w:tab/>
+      </w:r>
+      <w:r>
+        <w:t xml:space="preserve">Confirm any AI tool subscription or purchase came through the acquisition gate (</w:t>
+      </w:r>
+      <w:r>
+        <w:t xml:space="preserve">Acquisition gate checklist</w:t>
+      </w:r>
+      <w:r>
+        <w:t xml:space="preserve">), and send it to intake if it did not </w:t>
+      </w:r>
+      <w:r>
+        <w:rPr>
+          <w:b/>
+        </w:rPr>
+        <w:t xml:space="preserve">XW-009</w:t>
+      </w:r>
+      <w:r>
+        <w:t xml:space="preserve"> </w:t>
+      </w:r>
+      <w:r>
+        <w:rPr>
+          <w:b/>
+        </w:rPr>
+        <w:t xml:space="preserve">XW-021</w:t>
+      </w:r>
+    </w:p>
+    <w:p>
+      <w:pPr>
+        <w:spacing w:after="60"/>
+        <w:ind w:left="720" w:hanging="360"/>
+      </w:pPr>
+      <w:r>
+        <w:t xml:space="preserve">12.</w:t>
+      </w:r>
+      <w:r>
+        <w:tab/>
+      </w:r>
+      <w:r>
+        <w:t xml:space="preserve">Check spend outside procurement, such as expense cards and department purchases, for AI-enabled tools, and run intake on each one found </w:t>
+      </w:r>
+      <w:r>
+        <w:rPr>
+          <w:b/>
+        </w:rPr>
+        <w:t xml:space="preserve">XW-012</w:t>
+      </w:r>
+      <w:r>
+        <w:t xml:space="preserve"> </w:t>
+      </w:r>
+      <w:r>
+        <w:rPr>
+          <w:b/>
+        </w:rPr>
+        <w:t xml:space="preserve">XW-022</w:t>
+      </w:r>
+    </w:p>
+    <w:p>
+      <w:pPr>
+        <w:spacing w:after="60"/>
+        <w:ind w:left="720" w:hanging="360"/>
+      </w:pPr>
+      <w:r>
+        <w:t xml:space="preserve">13.</w:t>
+      </w:r>
+      <w:r>
+        <w:tab/>
+      </w:r>
+      <w:r>
+        <w:t xml:space="preserve">Keep an approved-AI-tools register of tools that passed intake, so staff can check it before buying </w:t>
+      </w:r>
+      <w:r>
+        <w:rPr>
+          <w:b/>
+        </w:rPr>
+        <w:t xml:space="preserve">XW-022</w:t>
       </w:r>
     </w:p>
     <w:sectPr>

</xml_diff>